<commit_message>
Add live GitHub repository links
</commit_message>
<xml_diff>
--- a/submission_viruses/HBV_DQB10301_viruses_cover_letter.docx
+++ b/submission_viruses/HBV_DQB10301_viruses_cover_letter.docx
@@ -251,7 +251,7 @@
         <w:rPr>
           <w:rFonts w:ascii="Times New Roman" w:hAnsi="Times New Roman"/>
         </w:rPr>
-        <w:t>figures, and one-step reproduction instructions are prepared for deposition in</w:t>
+        <w:t>figures, and one-step reproduction instructions are available in a public GitHub</w:t>
       </w:r>
     </w:p>
     <w:p>
@@ -259,7 +259,15 @@
         <w:rPr>
           <w:rFonts w:ascii="Times New Roman" w:hAnsi="Times New Roman"/>
         </w:rPr>
-        <w:t>a public GitHub repository and archival Zenodo release before submission. No</w:t>
+        <w:t>repository at https://github.com/llf48/HBV-DQB10301-public-immunogenomics, with</w:t>
+      </w:r>
+    </w:p>
+    <w:p>
+      <w:r>
+        <w:rPr>
+          <w:rFonts w:ascii="Times New Roman" w:hAnsi="Times New Roman"/>
+        </w:rPr>
+        <w:t>a Zenodo archival release to be added before submission. No</w:t>
       </w:r>
     </w:p>
     <w:p>

</xml_diff>